<commit_message>
Fixed display of minor past addresses in addendum and confidential addendum; display of parties in previous proceedings still in progress
</commit_message>
<xml_diff>
--- a/docassemble/CLAGuardianship/data/templates/care_or_custody_proceedings_appendix.docx
+++ b/docassemble/CLAGuardianship/data/templates/care_or_custody_proceedings_appendix.docx
@@ -1,6 +1,6 @@
 
 <file path=word/document.xml><?xml version="1.0" encoding="utf-8"?>
-<w:document xmlns:wpc="http://schemas.microsoft.com/office/word/2010/wordprocessingCanvas" xmlns:cx="http://schemas.microsoft.com/office/drawing/2014/chartex" xmlns:cx1="http://schemas.microsoft.com/office/drawing/2015/9/8/chartex" xmlns:mc="http://schemas.openxmlformats.org/markup-compatibility/2006" xmlns:o="urn:schemas-microsoft-com:office:office" xmlns:r="http://schemas.openxmlformats.org/officeDocument/2006/relationships" xmlns:m="http://schemas.openxmlformats.org/officeDocument/2006/math" xmlns:v="urn:schemas-microsoft-com:vml" xmlns:wp14="http://schemas.microsoft.com/office/word/2010/wordprocessingDrawing" xmlns:wp="http://schemas.openxmlformats.org/drawingml/2006/wordprocessingDrawing" xmlns:w10="urn:schemas-microsoft-com:office:word" xmlns:w="http://schemas.openxmlformats.org/wordprocessingml/2006/main" xmlns:w14="http://schemas.microsoft.com/office/word/2010/wordml" xmlns:w15="http://schemas.microsoft.com/office/word/2012/wordml" xmlns:w16se="http://schemas.microsoft.com/office/word/2015/wordml/symex" xmlns:wpg="http://schemas.microsoft.com/office/word/2010/wordprocessingGroup" xmlns:wpi="http://schemas.microsoft.com/office/word/2010/wordprocessingInk" xmlns:wne="http://schemas.microsoft.com/office/word/2006/wordml" xmlns:wps="http://schemas.microsoft.com/office/word/2010/wordprocessingShape" mc:Ignorable="w14 w15 w16se wp14">
+<w:document xmlns:wpc="http://schemas.microsoft.com/office/word/2010/wordprocessingCanvas" xmlns:cx="http://schemas.microsoft.com/office/drawing/2014/chartex" xmlns:cx1="http://schemas.microsoft.com/office/drawing/2015/9/8/chartex" xmlns:cx2="http://schemas.microsoft.com/office/drawing/2015/10/21/chartex" xmlns:cx3="http://schemas.microsoft.com/office/drawing/2016/5/9/chartex" xmlns:cx4="http://schemas.microsoft.com/office/drawing/2016/5/10/chartex" xmlns:cx5="http://schemas.microsoft.com/office/drawing/2016/5/11/chartex" xmlns:cx6="http://schemas.microsoft.com/office/drawing/2016/5/12/chartex" xmlns:cx7="http://schemas.microsoft.com/office/drawing/2016/5/13/chartex" xmlns:cx8="http://schemas.microsoft.com/office/drawing/2016/5/14/chartex" xmlns:mc="http://schemas.openxmlformats.org/markup-compatibility/2006" xmlns:aink="http://schemas.microsoft.com/office/drawing/2016/ink" xmlns:am3d="http://schemas.microsoft.com/office/drawing/2017/model3d" xmlns:o="urn:schemas-microsoft-com:office:office" xmlns:oel="http://schemas.microsoft.com/office/2019/extlst" xmlns:r="http://schemas.openxmlformats.org/officeDocument/2006/relationships" xmlns:m="http://schemas.openxmlformats.org/officeDocument/2006/math" xmlns:v="urn:schemas-microsoft-com:vml" xmlns:wp14="http://schemas.microsoft.com/office/word/2010/wordprocessingDrawing" xmlns:wp="http://schemas.openxmlformats.org/drawingml/2006/wordprocessingDrawing" xmlns:w10="urn:schemas-microsoft-com:office:word" xmlns:w="http://schemas.openxmlformats.org/wordprocessingml/2006/main" xmlns:w14="http://schemas.microsoft.com/office/word/2010/wordml" xmlns:w15="http://schemas.microsoft.com/office/word/2012/wordml" xmlns:w16cex="http://schemas.microsoft.com/office/word/2018/wordml/cex" xmlns:w16cid="http://schemas.microsoft.com/office/word/2016/wordml/cid" xmlns:w16="http://schemas.microsoft.com/office/word/2018/wordml" xmlns:w16sdtdh="http://schemas.microsoft.com/office/word/2020/wordml/sdtdatahash" xmlns:w16se="http://schemas.microsoft.com/office/word/2015/wordml/symex" xmlns:wpg="http://schemas.microsoft.com/office/word/2010/wordprocessingGroup" xmlns:wpi="http://schemas.microsoft.com/office/word/2010/wordprocessingInk" xmlns:wne="http://schemas.microsoft.com/office/word/2006/wordml" xmlns:wps="http://schemas.microsoft.com/office/word/2010/wordprocessingShape" mc:Ignorable="w14 w15 w16se w16cid w16 w16cex w16sdtdh wp14">
   <w:body>
     <w:p>
       <w:pPr>
@@ -211,76 +211,6 @@
     </w:p>
     <w:p>
       <w:pPr>
-        <w:suppressAutoHyphens/>
-        <w:spacing w:line="240" w:lineRule="atLeast"/>
-        <w:contextualSpacing/>
-        <w:rPr>
-          <w:rFonts w:ascii="Times New Roman" w:eastAsia="Times New Roman" w:hAnsi="Times New Roman" w:cs="Times New Roman"/>
-          <w:kern w:val="0"/>
-          <w:lang w:eastAsia="en-US" w:bidi="ar-SA"/>
-        </w:rPr>
-      </w:pPr>
-      <w:r>
-        <w:rPr>
-          <w:rFonts w:ascii="Times New Roman" w:eastAsia="Times New Roman" w:hAnsi="Times New Roman" w:cs="Times New Roman"/>
-          <w:kern w:val="0"/>
-          <w:lang w:eastAsia="en-US" w:bidi="ar-SA"/>
-        </w:rPr>
-        <w:t xml:space="preserve">{{ </w:t>
-      </w:r>
-      <w:r>
-        <w:rPr>
-          <w:rFonts w:ascii="Times New Roman" w:eastAsia="Times New Roman" w:hAnsi="Times New Roman" w:cs="Times New Roman"/>
-          <w:kern w:val="0"/>
-          <w:lang w:eastAsia="en-US" w:bidi="ar-SA"/>
-        </w:rPr>
-        <w:t>users</w:t>
-      </w:r>
-      <w:r>
-        <w:rPr>
-          <w:rFonts w:ascii="Times New Roman" w:eastAsia="Times New Roman" w:hAnsi="Times New Roman" w:cs="Times New Roman"/>
-          <w:kern w:val="0"/>
-          <w:lang w:eastAsia="en-US" w:bidi="ar-SA"/>
-        </w:rPr>
-        <w:t xml:space="preserve"> }},</w:t>
-      </w:r>
-    </w:p>
-    <w:p>
-      <w:pPr>
-        <w:suppressAutoHyphens/>
-        <w:spacing w:line="240" w:lineRule="atLeast"/>
-        <w:contextualSpacing/>
-        <w:rPr>
-          <w:rFonts w:ascii="Times New Roman" w:eastAsia="Times New Roman" w:hAnsi="Times New Roman" w:cs="Times New Roman"/>
-          <w:b/>
-          <w:kern w:val="0"/>
-          <w:lang w:eastAsia="en-US" w:bidi="ar-SA"/>
-        </w:rPr>
-      </w:pPr>
-      <w:r>
-        <w:rPr>
-          <w:rFonts w:ascii="Times New Roman" w:eastAsia="Times New Roman" w:hAnsi="Times New Roman" w:cs="Times New Roman"/>
-          <w:b/>
-          <w:kern w:val="0"/>
-          <w:lang w:eastAsia="en-US" w:bidi="ar-SA"/>
-        </w:rPr>
-        <w:t>Plaintiff</w:t>
-      </w:r>
-    </w:p>
-    <w:p>
-      <w:pPr>
-        <w:suppressAutoHyphens/>
-        <w:spacing w:line="240" w:lineRule="atLeast"/>
-        <w:contextualSpacing/>
-        <w:rPr>
-          <w:rFonts w:ascii="Times New Roman" w:eastAsia="Times New Roman" w:hAnsi="Times New Roman" w:cs="Times New Roman"/>
-          <w:kern w:val="0"/>
-          <w:lang w:eastAsia="en-US" w:bidi="ar-SA"/>
-        </w:rPr>
-      </w:pPr>
-    </w:p>
-    <w:p>
-      <w:pPr>
         <w:tabs>
           <w:tab w:val="left" w:pos="5040"/>
         </w:tabs>
@@ -300,7 +230,7 @@
           <w:kern w:val="0"/>
           <w:lang w:eastAsia="en-US" w:bidi="ar-SA"/>
         </w:rPr>
-        <w:t>vs.</w:t>
+        <w:t>{{ case_name }}</w:t>
       </w:r>
       <w:r>
         <w:rPr>
@@ -333,72 +263,6 @@
         <w:contextualSpacing/>
         <w:rPr>
           <w:rFonts w:ascii="Times New Roman" w:eastAsia="Times New Roman" w:hAnsi="Times New Roman" w:cs="Times New Roman"/>
-          <w:kern w:val="0"/>
-          <w:lang w:eastAsia="en-US" w:bidi="ar-SA"/>
-        </w:rPr>
-      </w:pPr>
-      <w:r>
-        <w:rPr>
-          <w:rFonts w:ascii="Times New Roman" w:eastAsia="Times New Roman" w:hAnsi="Times New Roman" w:cs="Times New Roman"/>
-          <w:kern w:val="0"/>
-          <w:lang w:eastAsia="en-US" w:bidi="ar-SA"/>
-        </w:rPr>
-        <w:t xml:space="preserve">{{ </w:t>
-      </w:r>
-      <w:r>
-        <w:rPr>
-          <w:rFonts w:ascii="Times New Roman" w:eastAsia="Times New Roman" w:hAnsi="Times New Roman" w:cs="Times New Roman"/>
-          <w:kern w:val="0"/>
-          <w:lang w:eastAsia="en-US" w:bidi="ar-SA"/>
-        </w:rPr>
-        <w:t xml:space="preserve">other_parties </w:t>
-      </w:r>
-      <w:r>
-        <w:rPr>
-          <w:rFonts w:ascii="Times New Roman" w:eastAsia="Times New Roman" w:hAnsi="Times New Roman" w:cs="Times New Roman"/>
-          <w:kern w:val="0"/>
-          <w:lang w:eastAsia="en-US" w:bidi="ar-SA"/>
-        </w:rPr>
-        <w:t>}}</w:t>
-      </w:r>
-    </w:p>
-    <w:p>
-      <w:pPr>
-        <w:tabs>
-          <w:tab w:val="left" w:pos="5040"/>
-        </w:tabs>
-        <w:suppressAutoHyphens/>
-        <w:spacing w:line="240" w:lineRule="atLeast"/>
-        <w:ind w:left="5040" w:hanging="5040"/>
-        <w:contextualSpacing/>
-        <w:rPr>
-          <w:rFonts w:ascii="Times New Roman" w:eastAsia="Times New Roman" w:hAnsi="Times New Roman" w:cs="Times New Roman"/>
-          <w:b/>
-          <w:kern w:val="0"/>
-          <w:lang w:eastAsia="en-US" w:bidi="ar-SA"/>
-        </w:rPr>
-      </w:pPr>
-      <w:r>
-        <w:rPr>
-          <w:rFonts w:ascii="Times New Roman" w:eastAsia="Times New Roman" w:hAnsi="Times New Roman" w:cs="Times New Roman"/>
-          <w:b/>
-          <w:kern w:val="0"/>
-          <w:lang w:eastAsia="en-US" w:bidi="ar-SA"/>
-        </w:rPr>
-        <w:t>Defendant</w:t>
-      </w:r>
-    </w:p>
-    <w:p>
-      <w:pPr>
-        <w:tabs>
-          <w:tab w:val="left" w:pos="5040"/>
-        </w:tabs>
-        <w:suppressAutoHyphens/>
-        <w:spacing w:line="240" w:lineRule="atLeast"/>
-        <w:ind w:left="5040" w:hanging="5040"/>
-        <w:contextualSpacing/>
-        <w:rPr>
-          <w:rFonts w:ascii="Times New Roman" w:eastAsia="Times New Roman" w:hAnsi="Times New Roman" w:cs="Times New Roman"/>
           <w:b/>
           <w:kern w:val="0"/>
           <w:lang w:eastAsia="en-US" w:bidi="ar-SA"/>
@@ -424,49 +288,55 @@
           <w:sz w:val="22"/>
           <w:szCs w:val="22"/>
         </w:rPr>
-        <w:t>children_of_both</w:t>
-      </w:r>
-      <w:r>
-        <w:t>.number()</w:t>
-      </w:r>
-      <w:r>
-        <w:rPr>
-          <w:sz w:val="22"/>
-          <w:szCs w:val="22"/>
-        </w:rPr>
-        <w:t xml:space="preserve"> &gt; 3 </w:t>
-      </w:r>
-      <w:r>
-        <w:rPr>
-          <w:sz w:val="22"/>
-          <w:szCs w:val="22"/>
-        </w:rPr>
-        <w:t>%}</w:t>
-      </w:r>
-    </w:p>
-    <w:p>
-      <w:pPr>
-        <w:rPr>
-          <w:b/>
-          <w:sz w:val="22"/>
-          <w:szCs w:val="22"/>
-        </w:rPr>
-      </w:pPr>
-      <w:r>
-        <w:rPr>
-          <w:b/>
-          <w:sz w:val="22"/>
-          <w:szCs w:val="22"/>
-        </w:rPr>
-        <w:t>SECTION 2.</w:t>
-      </w:r>
-      <w:r>
-        <w:rPr>
-          <w:b/>
-          <w:sz w:val="22"/>
-          <w:szCs w:val="22"/>
-        </w:rPr>
-        <w:t>Additional Children</w:t>
+        <w:t>multiple_previous_addresses</w:t>
+      </w:r>
+      <w:r>
+        <w:rPr>
+          <w:sz w:val="22"/>
+          <w:szCs w:val="22"/>
+        </w:rPr>
+        <w:t xml:space="preserve"> %}</w:t>
+      </w:r>
+    </w:p>
+    <w:p>
+      <w:pPr>
+        <w:rPr>
+          <w:b/>
+          <w:sz w:val="22"/>
+          <w:szCs w:val="22"/>
+        </w:rPr>
+      </w:pPr>
+      <w:r>
+        <w:rPr>
+          <w:b/>
+          <w:sz w:val="22"/>
+          <w:szCs w:val="22"/>
+        </w:rPr>
+        <w:t xml:space="preserve">SECTION </w:t>
+      </w:r>
+      <w:r>
+        <w:rPr>
+          <w:b/>
+          <w:sz w:val="22"/>
+          <w:szCs w:val="22"/>
+        </w:rPr>
+        <w:t>4</w:t>
+      </w:r>
+      <w:r>
+        <w:rPr>
+          <w:b/>
+          <w:sz w:val="22"/>
+          <w:szCs w:val="22"/>
+        </w:rPr>
+        <w:t>.</w:t>
+      </w:r>
+      <w:r>
+        <w:rPr>
+          <w:b/>
+          <w:sz w:val="22"/>
+          <w:szCs w:val="22"/>
+        </w:rPr>
+        <w:t xml:space="preserve"> Past Addresses</w:t>
       </w:r>
     </w:p>
     <w:tbl>
@@ -507,21 +377,7 @@
                 <w:sz w:val="22"/>
                 <w:szCs w:val="22"/>
               </w:rPr>
-              <w:t xml:space="preserve">{%tr for child in </w:t>
-            </w:r>
-            <w:r>
-              <w:rPr>
-                <w:sz w:val="22"/>
-                <w:szCs w:val="22"/>
-              </w:rPr>
-              <w:t>children_of_both</w:t>
-            </w:r>
-            <w:r>
-              <w:rPr>
-                <w:sz w:val="22"/>
-                <w:szCs w:val="22"/>
-              </w:rPr>
-              <w:t>[3:] %}</w:t>
+              <w:t>{%tr for child in children_of_both %}</w:t>
             </w:r>
           </w:p>
         </w:tc>
@@ -608,21 +464,7 @@
                 <w:sz w:val="22"/>
                 <w:szCs w:val="22"/>
               </w:rPr>
-              <w:t>{%tr for address in child.p</w:t>
-            </w:r>
-            <w:r>
-              <w:rPr>
-                <w:sz w:val="22"/>
-                <w:szCs w:val="22"/>
-              </w:rPr>
-              <w:t>revious</w:t>
-            </w:r>
-            <w:r>
-              <w:rPr>
-                <w:sz w:val="22"/>
-                <w:szCs w:val="22"/>
-              </w:rPr>
-              <w:t>_addresses %}</w:t>
+              <w:t>{%tr for address in child.previous_addresses %}</w:t>
             </w:r>
           </w:p>
         </w:tc>
@@ -895,6 +737,13 @@
                 <w:sz w:val="22"/>
                 <w:szCs w:val="22"/>
               </w:rPr>
+              <w:t xml:space="preserve"> </w:t>
+            </w:r>
+            <w:r>
+              <w:rPr>
+                <w:sz w:val="22"/>
+                <w:szCs w:val="22"/>
+              </w:rPr>
               <w:t>%}</w:t>
             </w:r>
           </w:p>
@@ -1145,16 +994,19 @@
         <w:t>attorneys_for_children</w:t>
       </w:r>
       <w:r>
-        <w:t>.number()</w:t>
-      </w:r>
-      <w:r>
-        <w:t xml:space="preserve"> &gt; 3</w:t>
+        <w:t>.number() &gt; 3</w:t>
       </w:r>
       <w:r>
         <w:t xml:space="preserve"> %}</w:t>
       </w:r>
     </w:p>
-    <w:p/>
+    <w:p>
+      <w:pPr>
+        <w:rPr>
+          <w:b/>
+        </w:rPr>
+      </w:pPr>
+    </w:p>
     <w:p>
       <w:pPr>
         <w:rPr>
@@ -1298,6 +1150,7 @@
         </w:numPr>
       </w:pPr>
       <w:r>
+        <w:lastRenderedPageBreak/>
         <w:t xml:space="preserve">{{ </w:t>
       </w:r>
       <w:r>
@@ -1340,8 +1193,6 @@
       <w:r>
         <w:t>.number()</w:t>
       </w:r>
-      <w:bookmarkStart w:id="0" w:name="_GoBack"/>
-      <w:bookmarkEnd w:id="0"/>
       <w:r>
         <w:t xml:space="preserve"> </w:t>
       </w:r>
@@ -1456,7 +1307,36 @@
           <w:sz w:val="22"/>
           <w:szCs w:val="22"/>
         </w:rPr>
-        <w:t xml:space="preserve"> if need_past_address_appendix %}</w:t>
+        <w:t xml:space="preserve"> if </w:t>
+      </w:r>
+      <w:r>
+        <w:rPr>
+          <w:sz w:val="22"/>
+          <w:szCs w:val="22"/>
+        </w:rPr>
+        <w:t>confidential_address</w:t>
+      </w:r>
+      <w:r>
+        <w:rPr>
+          <w:sz w:val="22"/>
+          <w:szCs w:val="22"/>
+        </w:rPr>
+        <w:t xml:space="preserve"> and </w:t>
+      </w:r>
+      <w:r>
+        <w:rPr>
+          <w:sz w:val="22"/>
+          <w:szCs w:val="22"/>
+        </w:rPr>
+        <w:t>multiple_previous_addresses</w:t>
+      </w:r>
+      <w:r>
+        <w:rPr>
+          <w:rFonts w:hint="eastAsia"/>
+          <w:sz w:val="22"/>
+          <w:szCs w:val="22"/>
+        </w:rPr>
+        <w:t xml:space="preserve"> %}</w:t>
       </w:r>
     </w:p>
     <w:p>
@@ -1509,6 +1389,7 @@
           <w:sz w:val="36"/>
           <w:lang w:eastAsia="en-US" w:bidi="ar-SA"/>
         </w:rPr>
+        <w:lastRenderedPageBreak/>
         <w:t xml:space="preserve">CONFIDENTIAL </w:t>
       </w:r>
       <w:r>
@@ -1696,76 +1577,6 @@
     </w:p>
     <w:p>
       <w:pPr>
-        <w:suppressAutoHyphens/>
-        <w:spacing w:line="240" w:lineRule="atLeast"/>
-        <w:contextualSpacing/>
-        <w:rPr>
-          <w:rFonts w:ascii="Times New Roman" w:eastAsia="Times New Roman" w:hAnsi="Times New Roman" w:cs="Times New Roman"/>
-          <w:kern w:val="0"/>
-          <w:lang w:eastAsia="en-US" w:bidi="ar-SA"/>
-        </w:rPr>
-      </w:pPr>
-      <w:r>
-        <w:rPr>
-          <w:rFonts w:ascii="Times New Roman" w:eastAsia="Times New Roman" w:hAnsi="Times New Roman" w:cs="Times New Roman"/>
-          <w:kern w:val="0"/>
-          <w:lang w:eastAsia="en-US" w:bidi="ar-SA"/>
-        </w:rPr>
-        <w:t xml:space="preserve">{{ </w:t>
-      </w:r>
-      <w:r>
-        <w:rPr>
-          <w:rFonts w:ascii="Times New Roman" w:eastAsia="Times New Roman" w:hAnsi="Times New Roman" w:cs="Times New Roman"/>
-          <w:kern w:val="0"/>
-          <w:lang w:eastAsia="en-US" w:bidi="ar-SA"/>
-        </w:rPr>
-        <w:t>users</w:t>
-      </w:r>
-      <w:r>
-        <w:rPr>
-          <w:rFonts w:ascii="Times New Roman" w:eastAsia="Times New Roman" w:hAnsi="Times New Roman" w:cs="Times New Roman"/>
-          <w:kern w:val="0"/>
-          <w:lang w:eastAsia="en-US" w:bidi="ar-SA"/>
-        </w:rPr>
-        <w:t xml:space="preserve"> }},</w:t>
-      </w:r>
-    </w:p>
-    <w:p>
-      <w:pPr>
-        <w:suppressAutoHyphens/>
-        <w:spacing w:line="240" w:lineRule="atLeast"/>
-        <w:contextualSpacing/>
-        <w:rPr>
-          <w:rFonts w:ascii="Times New Roman" w:eastAsia="Times New Roman" w:hAnsi="Times New Roman" w:cs="Times New Roman"/>
-          <w:b/>
-          <w:kern w:val="0"/>
-          <w:lang w:eastAsia="en-US" w:bidi="ar-SA"/>
-        </w:rPr>
-      </w:pPr>
-      <w:r>
-        <w:rPr>
-          <w:rFonts w:ascii="Times New Roman" w:eastAsia="Times New Roman" w:hAnsi="Times New Roman" w:cs="Times New Roman"/>
-          <w:b/>
-          <w:kern w:val="0"/>
-          <w:lang w:eastAsia="en-US" w:bidi="ar-SA"/>
-        </w:rPr>
-        <w:t>Plaintiff</w:t>
-      </w:r>
-    </w:p>
-    <w:p>
-      <w:pPr>
-        <w:suppressAutoHyphens/>
-        <w:spacing w:line="240" w:lineRule="atLeast"/>
-        <w:contextualSpacing/>
-        <w:rPr>
-          <w:rFonts w:ascii="Times New Roman" w:eastAsia="Times New Roman" w:hAnsi="Times New Roman" w:cs="Times New Roman"/>
-          <w:kern w:val="0"/>
-          <w:lang w:eastAsia="en-US" w:bidi="ar-SA"/>
-        </w:rPr>
-      </w:pPr>
-    </w:p>
-    <w:p>
-      <w:pPr>
         <w:tabs>
           <w:tab w:val="left" w:pos="5040"/>
         </w:tabs>
@@ -1785,7 +1596,7 @@
           <w:kern w:val="0"/>
           <w:lang w:eastAsia="en-US" w:bidi="ar-SA"/>
         </w:rPr>
-        <w:t>vs.</w:t>
+        <w:t>{{ case_name }}</w:t>
       </w:r>
       <w:r>
         <w:rPr>
@@ -1809,216 +1620,18 @@
     </w:p>
     <w:p>
       <w:pPr>
-        <w:tabs>
-          <w:tab w:val="left" w:pos="5040"/>
-        </w:tabs>
-        <w:suppressAutoHyphens/>
-        <w:spacing w:line="240" w:lineRule="atLeast"/>
-        <w:ind w:left="5040" w:hanging="5040"/>
-        <w:contextualSpacing/>
-        <w:rPr>
-          <w:rFonts w:ascii="Times New Roman" w:eastAsia="Times New Roman" w:hAnsi="Times New Roman" w:cs="Times New Roman"/>
-          <w:kern w:val="0"/>
-          <w:lang w:eastAsia="en-US" w:bidi="ar-SA"/>
-        </w:rPr>
-      </w:pPr>
-      <w:r>
-        <w:rPr>
-          <w:rFonts w:ascii="Times New Roman" w:eastAsia="Times New Roman" w:hAnsi="Times New Roman" w:cs="Times New Roman"/>
-          <w:kern w:val="0"/>
-          <w:lang w:eastAsia="en-US" w:bidi="ar-SA"/>
-        </w:rPr>
-        <w:t xml:space="preserve">{{ </w:t>
-      </w:r>
-      <w:r>
-        <w:rPr>
-          <w:rFonts w:ascii="Times New Roman" w:eastAsia="Times New Roman" w:hAnsi="Times New Roman" w:cs="Times New Roman"/>
-          <w:kern w:val="0"/>
-          <w:lang w:eastAsia="en-US" w:bidi="ar-SA"/>
-        </w:rPr>
-        <w:t xml:space="preserve">other_parties </w:t>
-      </w:r>
-      <w:r>
-        <w:rPr>
-          <w:rFonts w:ascii="Times New Roman" w:eastAsia="Times New Roman" w:hAnsi="Times New Roman" w:cs="Times New Roman"/>
-          <w:kern w:val="0"/>
-          <w:lang w:eastAsia="en-US" w:bidi="ar-SA"/>
-        </w:rPr>
-        <w:t>}}</w:t>
-      </w:r>
-    </w:p>
-    <w:p>
-      <w:pPr>
-        <w:tabs>
-          <w:tab w:val="left" w:pos="5040"/>
-        </w:tabs>
-        <w:suppressAutoHyphens/>
-        <w:spacing w:line="240" w:lineRule="atLeast"/>
-        <w:ind w:left="5040" w:hanging="5040"/>
-        <w:contextualSpacing/>
-        <w:rPr>
-          <w:rFonts w:ascii="Times New Roman" w:eastAsia="Times New Roman" w:hAnsi="Times New Roman" w:cs="Times New Roman"/>
-          <w:b/>
-          <w:kern w:val="0"/>
-          <w:lang w:eastAsia="en-US" w:bidi="ar-SA"/>
-        </w:rPr>
-      </w:pPr>
-      <w:r>
-        <w:rPr>
-          <w:rFonts w:ascii="Times New Roman" w:eastAsia="Times New Roman" w:hAnsi="Times New Roman" w:cs="Times New Roman"/>
-          <w:b/>
-          <w:kern w:val="0"/>
-          <w:lang w:eastAsia="en-US" w:bidi="ar-SA"/>
-        </w:rPr>
-        <w:t>Defendant</w:t>
-      </w:r>
-    </w:p>
-    <w:p>
-      <w:pPr>
-        <w:rPr>
-          <w:sz w:val="22"/>
-          <w:szCs w:val="22"/>
-        </w:rPr>
-      </w:pPr>
-    </w:p>
-    <w:p>
-      <w:pPr>
-        <w:ind w:firstLine="420"/>
-        <w:rPr>
-          <w:sz w:val="22"/>
-          <w:szCs w:val="22"/>
-        </w:rPr>
-      </w:pPr>
-      <w:r>
-        <w:rPr>
-          <w:rFonts w:hint="eastAsia"/>
-          <w:sz w:val="22"/>
-          <w:szCs w:val="22"/>
-        </w:rPr>
-        <w:t>{%</w:t>
-      </w:r>
-      <w:r>
-        <w:rPr>
-          <w:sz w:val="22"/>
-          <w:szCs w:val="22"/>
-        </w:rPr>
-        <w:t>p</w:t>
-      </w:r>
-      <w:r>
-        <w:rPr>
-          <w:rFonts w:hint="eastAsia"/>
-          <w:sz w:val="22"/>
-          <w:szCs w:val="22"/>
-        </w:rPr>
-        <w:t xml:space="preserve"> for child in </w:t>
-      </w:r>
-      <w:r>
-        <w:rPr>
-          <w:sz w:val="22"/>
-          <w:szCs w:val="22"/>
-        </w:rPr>
-        <w:t>children_of_both</w:t>
-      </w:r>
-      <w:r>
-        <w:rPr>
-          <w:rFonts w:hint="eastAsia"/>
-          <w:sz w:val="22"/>
-          <w:szCs w:val="22"/>
-        </w:rPr>
-        <w:t xml:space="preserve"> </w:t>
-      </w:r>
-      <w:r>
-        <w:rPr>
-          <w:rFonts w:hint="eastAsia"/>
-          <w:sz w:val="22"/>
-          <w:szCs w:val="22"/>
-        </w:rPr>
-        <w:t>%}</w:t>
-      </w:r>
-    </w:p>
-    <w:p>
-      <w:pPr>
-        <w:rPr>
-          <w:sz w:val="22"/>
-          <w:szCs w:val="22"/>
-        </w:rPr>
-      </w:pPr>
-    </w:p>
-    <w:p>
-      <w:pPr>
-        <w:ind w:left="420" w:firstLine="420"/>
-        <w:rPr>
-          <w:sz w:val="22"/>
-          <w:szCs w:val="22"/>
-        </w:rPr>
-      </w:pPr>
-      <w:r>
-        <w:rPr>
-          <w:rFonts w:hint="eastAsia"/>
-          <w:sz w:val="22"/>
-          <w:szCs w:val="22"/>
-        </w:rPr>
-        <w:t>{%</w:t>
-      </w:r>
-      <w:r>
-        <w:rPr>
-          <w:sz w:val="22"/>
-          <w:szCs w:val="22"/>
-        </w:rPr>
-        <w:t>p</w:t>
-      </w:r>
-      <w:r>
-        <w:rPr>
-          <w:rFonts w:hint="eastAsia"/>
-          <w:sz w:val="22"/>
-          <w:szCs w:val="22"/>
-        </w:rPr>
-        <w:t xml:space="preserve"> if </w:t>
-      </w:r>
-      <w:r>
-        <w:rPr>
-          <w:rFonts w:hint="eastAsia"/>
-          <w:sz w:val="22"/>
-          <w:szCs w:val="22"/>
-        </w:rPr>
-        <w:t>child.</w:t>
-      </w:r>
-      <w:r>
-        <w:rPr>
-          <w:rFonts w:hint="eastAsia"/>
-          <w:sz w:val="22"/>
-          <w:szCs w:val="22"/>
-        </w:rPr>
-        <w:t>too_many_previous_addresses</w:t>
-      </w:r>
-      <w:r>
-        <w:rPr>
-          <w:sz w:val="22"/>
-          <w:szCs w:val="22"/>
-        </w:rPr>
-        <w:t xml:space="preserve"> </w:t>
-      </w:r>
-      <w:r>
-        <w:rPr>
-          <w:rFonts w:hint="eastAsia"/>
-          <w:sz w:val="22"/>
-          <w:szCs w:val="22"/>
-        </w:rPr>
-        <w:t>%}</w:t>
-      </w:r>
-    </w:p>
-    <w:p>
-      <w:pPr>
-        <w:rPr>
-          <w:sz w:val="22"/>
-          <w:szCs w:val="22"/>
-        </w:rPr>
-      </w:pPr>
-    </w:p>
-    <w:p>
-      <w:pPr>
-        <w:rPr>
-          <w:b/>
+        <w:rPr>
+          <w:sz w:val="22"/>
+          <w:szCs w:val="22"/>
+        </w:rPr>
+      </w:pPr>
+    </w:p>
+    <w:p>
+      <w:pPr>
+        <w:rPr>
+          <w:b/>
+          <w:sz w:val="22"/>
+          <w:szCs w:val="22"/>
         </w:rPr>
       </w:pPr>
       <w:r>
@@ -2035,24 +1648,16 @@
           <w:sz w:val="22"/>
           <w:szCs w:val="22"/>
         </w:rPr>
-        <w:t>Additional Past Address Information for {{ child }}</w:t>
-      </w:r>
-      <w:r>
-        <w:rPr>
-          <w:b/>
-          <w:sz w:val="22"/>
-          <w:szCs w:val="22"/>
-        </w:rPr>
-        <w:t xml:space="preserve">  to be kept confidential</w:t>
-      </w:r>
-    </w:p>
-    <w:p>
-      <w:pPr>
-        <w:rPr>
-          <w:sz w:val="22"/>
-          <w:szCs w:val="22"/>
-        </w:rPr>
-      </w:pPr>
+        <w:t>Additional Past Address Information</w:t>
+      </w:r>
+      <w:r>
+        <w:rPr>
+          <w:b/>
+          <w:sz w:val="22"/>
+          <w:szCs w:val="22"/>
+        </w:rPr>
+        <w:t xml:space="preserve"> to be kept confidential</w:t>
+      </w:r>
     </w:p>
     <w:tbl>
       <w:tblPr>
@@ -2092,7 +1697,7 @@
                 <w:sz w:val="22"/>
                 <w:szCs w:val="22"/>
               </w:rPr>
-              <w:t>{%tr for address in child.previous_addresses[2:] %}</w:t>
+              <w:t>{%tr for child in children_of_both %}</w:t>
             </w:r>
           </w:p>
         </w:tc>
@@ -2121,7 +1726,7 @@
                 <w:sz w:val="22"/>
                 <w:szCs w:val="22"/>
               </w:rPr>
-              <w:t>Past Address</w:t>
+              <w:t>Child Name</w:t>
             </w:r>
           </w:p>
         </w:tc>
@@ -2145,7 +1750,133 @@
                 <w:sz w:val="22"/>
                 <w:szCs w:val="22"/>
               </w:rPr>
+              <w:t>{{ child.name.full() }}</w:t>
+            </w:r>
+          </w:p>
+        </w:tc>
+      </w:tr>
+      <w:tr>
+        <w:trPr>
+          <w:trHeight w:val="372"/>
+        </w:trPr>
+        <w:tc>
+          <w:tcPr>
+            <w:tcW w:w="9970" w:type="dxa"/>
+            <w:gridSpan w:val="2"/>
+            <w:tcBorders>
+              <w:top w:val="single" w:sz="2" w:space="0" w:color="000001"/>
+              <w:left w:val="single" w:sz="2" w:space="0" w:color="000001"/>
+              <w:bottom w:val="single" w:sz="2" w:space="0" w:color="000001"/>
+              <w:right w:val="single" w:sz="2" w:space="0" w:color="000001"/>
+            </w:tcBorders>
+            <w:shd w:val="clear" w:color="auto" w:fill="FFFFFF"/>
+          </w:tcPr>
+          <w:p>
+            <w:pPr>
+              <w:pStyle w:val="TableContents"/>
+              <w:rPr>
+                <w:sz w:val="22"/>
+                <w:szCs w:val="22"/>
+              </w:rPr>
+            </w:pPr>
+            <w:r>
+              <w:rPr>
+                <w:sz w:val="22"/>
+                <w:szCs w:val="22"/>
+              </w:rPr>
+              <w:t>{%tr for address in child.previous_addresses %}</w:t>
+            </w:r>
+          </w:p>
+        </w:tc>
+      </w:tr>
+      <w:tr>
+        <w:trPr>
+          <w:trHeight w:val="372"/>
+        </w:trPr>
+        <w:tc>
+          <w:tcPr>
+            <w:tcW w:w="2423" w:type="dxa"/>
+            <w:tcBorders>
+              <w:top w:val="single" w:sz="2" w:space="0" w:color="000001"/>
+              <w:left w:val="single" w:sz="2" w:space="0" w:color="000001"/>
+              <w:bottom w:val="single" w:sz="2" w:space="0" w:color="000001"/>
+              <w:right w:val="single" w:sz="2" w:space="0" w:color="000001"/>
+            </w:tcBorders>
+            <w:shd w:val="clear" w:color="auto" w:fill="FFFFFF"/>
+          </w:tcPr>
+          <w:p>
+            <w:pPr>
+              <w:pStyle w:val="TableContents"/>
+              <w:rPr>
+                <w:sz w:val="22"/>
+                <w:szCs w:val="22"/>
+              </w:rPr>
+            </w:pPr>
+            <w:r>
+              <w:rPr>
+                <w:sz w:val="22"/>
+                <w:szCs w:val="22"/>
+              </w:rPr>
+              <w:t>Past Address</w:t>
+            </w:r>
+          </w:p>
+        </w:tc>
+        <w:tc>
+          <w:tcPr>
+            <w:tcW w:w="7547" w:type="dxa"/>
+            <w:tcBorders>
+              <w:top w:val="single" w:sz="2" w:space="0" w:color="000001"/>
+              <w:left w:val="single" w:sz="2" w:space="0" w:color="000001"/>
+              <w:bottom w:val="single" w:sz="2" w:space="0" w:color="000001"/>
+              <w:right w:val="single" w:sz="2" w:space="0" w:color="000001"/>
+            </w:tcBorders>
+            <w:shd w:val="clear" w:color="auto" w:fill="FFFFFF"/>
+          </w:tcPr>
+          <w:p>
+            <w:pPr>
+              <w:pStyle w:val="TableContents"/>
+              <w:rPr>
+                <w:sz w:val="22"/>
+                <w:szCs w:val="22"/>
+              </w:rPr>
+            </w:pPr>
+            <w:r>
+              <w:rPr>
+                <w:sz w:val="22"/>
+                <w:szCs w:val="22"/>
+              </w:rPr>
               <w:t>{{ address.on_one_line() }}</w:t>
+            </w:r>
+          </w:p>
+        </w:tc>
+      </w:tr>
+      <w:tr>
+        <w:tc>
+          <w:tcPr>
+            <w:tcW w:w="9970" w:type="dxa"/>
+            <w:gridSpan w:val="2"/>
+            <w:tcBorders>
+              <w:top w:val="single" w:sz="2" w:space="0" w:color="000001"/>
+              <w:left w:val="single" w:sz="2" w:space="0" w:color="000001"/>
+              <w:bottom w:val="single" w:sz="2" w:space="0" w:color="000001"/>
+              <w:right w:val="single" w:sz="2" w:space="0" w:color="000001"/>
+            </w:tcBorders>
+            <w:shd w:val="clear" w:color="auto" w:fill="FFFFFF"/>
+          </w:tcPr>
+          <w:p>
+            <w:pPr>
+              <w:pStyle w:val="TableContents"/>
+              <w:rPr>
+                <w:sz w:val="22"/>
+                <w:szCs w:val="22"/>
+              </w:rPr>
+            </w:pPr>
+            <w:r>
+              <w:rPr>
+                <w:sz w:val="22"/>
+                <w:szCs w:val="22"/>
+              </w:rPr>
+              <w:t>{%tr endfor %}</w:t>
             </w:r>
           </w:p>
         </w:tc>
@@ -2180,133 +1911,18 @@
     </w:tbl>
     <w:p>
       <w:pPr>
-        <w:ind w:left="420" w:firstLine="420"/>
-        <w:rPr>
-          <w:sz w:val="22"/>
-          <w:szCs w:val="22"/>
-        </w:rPr>
-      </w:pPr>
-    </w:p>
-    <w:p>
-      <w:pPr>
-        <w:ind w:left="420" w:firstLine="420"/>
-        <w:rPr>
-          <w:sz w:val="22"/>
-          <w:szCs w:val="22"/>
-        </w:rPr>
-      </w:pPr>
-      <w:r>
-        <w:rPr>
-          <w:rFonts w:hint="eastAsia"/>
-          <w:sz w:val="22"/>
-          <w:szCs w:val="22"/>
-        </w:rPr>
-        <w:t>{%</w:t>
-      </w:r>
-      <w:r>
-        <w:rPr>
-          <w:sz w:val="22"/>
-          <w:szCs w:val="22"/>
-        </w:rPr>
-        <w:t>p</w:t>
-      </w:r>
-      <w:r>
-        <w:rPr>
-          <w:rFonts w:hint="eastAsia"/>
-          <w:sz w:val="22"/>
-          <w:szCs w:val="22"/>
-        </w:rPr>
-        <w:t xml:space="preserve"> endif %}</w:t>
-      </w:r>
-    </w:p>
-    <w:p>
-      <w:pPr>
-        <w:ind w:firstLine="420"/>
-        <w:rPr>
-          <w:sz w:val="22"/>
-          <w:szCs w:val="22"/>
-        </w:rPr>
-      </w:pPr>
-    </w:p>
-    <w:p>
-      <w:pPr>
-        <w:ind w:firstLine="420"/>
-        <w:rPr>
-          <w:sz w:val="22"/>
-          <w:szCs w:val="22"/>
-        </w:rPr>
-      </w:pPr>
-      <w:r>
-        <w:rPr>
-          <w:rFonts w:hint="eastAsia"/>
-          <w:sz w:val="22"/>
-          <w:szCs w:val="22"/>
-        </w:rPr>
-        <w:t>{%</w:t>
-      </w:r>
-      <w:r>
-        <w:rPr>
-          <w:sz w:val="22"/>
-          <w:szCs w:val="22"/>
-        </w:rPr>
-        <w:t>p</w:t>
-      </w:r>
-      <w:r>
-        <w:rPr>
-          <w:rFonts w:hint="eastAsia"/>
-          <w:sz w:val="22"/>
-          <w:szCs w:val="22"/>
-        </w:rPr>
-        <w:t xml:space="preserve"> endfor %}</w:t>
-      </w:r>
-    </w:p>
-    <w:p>
-      <w:pPr>
-        <w:ind w:firstLine="420"/>
-        <w:rPr>
-          <w:sz w:val="22"/>
-          <w:szCs w:val="22"/>
-        </w:rPr>
-      </w:pPr>
-    </w:p>
-    <w:p>
-      <w:pPr>
-        <w:rPr>
-          <w:sz w:val="22"/>
-          <w:szCs w:val="22"/>
-        </w:rPr>
-      </w:pPr>
-      <w:r>
-        <w:rPr>
-          <w:rFonts w:hint="eastAsia"/>
-          <w:sz w:val="22"/>
-          <w:szCs w:val="22"/>
-        </w:rPr>
-        <w:t>{%</w:t>
-      </w:r>
-      <w:r>
-        <w:rPr>
-          <w:sz w:val="22"/>
-          <w:szCs w:val="22"/>
-        </w:rPr>
-        <w:t>p</w:t>
-      </w:r>
-      <w:r>
-        <w:rPr>
-          <w:rFonts w:hint="eastAsia"/>
-          <w:sz w:val="22"/>
-          <w:szCs w:val="22"/>
-        </w:rPr>
-        <w:t xml:space="preserve"> endif %}</w:t>
-      </w:r>
-    </w:p>
-    <w:p>
-      <w:pPr>
-        <w:rPr>
-          <w:sz w:val="22"/>
-          <w:szCs w:val="22"/>
-        </w:rPr>
-      </w:pPr>
+        <w:rPr>
+          <w:sz w:val="22"/>
+          <w:szCs w:val="22"/>
+        </w:rPr>
+      </w:pPr>
+      <w:r>
+        <w:rPr>
+          <w:sz w:val="22"/>
+          <w:szCs w:val="22"/>
+        </w:rPr>
+        <w:t>{%p endif %}</w:t>
+      </w:r>
     </w:p>
     <w:sectPr>
       <w:headerReference w:type="default" r:id="rId7"/>
@@ -2321,7 +1937,7 @@
 </file>
 
 <file path=word/endnotes.xml><?xml version="1.0" encoding="utf-8"?>
-<w:endnotes xmlns:wpc="http://schemas.microsoft.com/office/word/2010/wordprocessingCanvas" xmlns:cx="http://schemas.microsoft.com/office/drawing/2014/chartex" xmlns:cx1="http://schemas.microsoft.com/office/drawing/2015/9/8/chartex" xmlns:mc="http://schemas.openxmlformats.org/markup-compatibility/2006" xmlns:o="urn:schemas-microsoft-com:office:office" xmlns:r="http://schemas.openxmlformats.org/officeDocument/2006/relationships" xmlns:m="http://schemas.openxmlformats.org/officeDocument/2006/math" xmlns:v="urn:schemas-microsoft-com:vml" xmlns:wp14="http://schemas.microsoft.com/office/word/2010/wordprocessingDrawing" xmlns:wp="http://schemas.openxmlformats.org/drawingml/2006/wordprocessingDrawing" xmlns:w10="urn:schemas-microsoft-com:office:word" xmlns:w="http://schemas.openxmlformats.org/wordprocessingml/2006/main" xmlns:w14="http://schemas.microsoft.com/office/word/2010/wordml" xmlns:w15="http://schemas.microsoft.com/office/word/2012/wordml" xmlns:w16se="http://schemas.microsoft.com/office/word/2015/wordml/symex" xmlns:wpg="http://schemas.microsoft.com/office/word/2010/wordprocessingGroup" xmlns:wpi="http://schemas.microsoft.com/office/word/2010/wordprocessingInk" xmlns:wne="http://schemas.microsoft.com/office/word/2006/wordml" xmlns:wps="http://schemas.microsoft.com/office/word/2010/wordprocessingShape" mc:Ignorable="w14 w15 w16se wp14">
+<w:endnotes xmlns:wpc="http://schemas.microsoft.com/office/word/2010/wordprocessingCanvas" xmlns:cx="http://schemas.microsoft.com/office/drawing/2014/chartex" xmlns:cx1="http://schemas.microsoft.com/office/drawing/2015/9/8/chartex" xmlns:cx2="http://schemas.microsoft.com/office/drawing/2015/10/21/chartex" xmlns:cx3="http://schemas.microsoft.com/office/drawing/2016/5/9/chartex" xmlns:cx4="http://schemas.microsoft.com/office/drawing/2016/5/10/chartex" xmlns:cx5="http://schemas.microsoft.com/office/drawing/2016/5/11/chartex" xmlns:cx6="http://schemas.microsoft.com/office/drawing/2016/5/12/chartex" xmlns:cx7="http://schemas.microsoft.com/office/drawing/2016/5/13/chartex" xmlns:cx8="http://schemas.microsoft.com/office/drawing/2016/5/14/chartex" xmlns:mc="http://schemas.openxmlformats.org/markup-compatibility/2006" xmlns:aink="http://schemas.microsoft.com/office/drawing/2016/ink" xmlns:am3d="http://schemas.microsoft.com/office/drawing/2017/model3d" xmlns:o="urn:schemas-microsoft-com:office:office" xmlns:oel="http://schemas.microsoft.com/office/2019/extlst" xmlns:r="http://schemas.openxmlformats.org/officeDocument/2006/relationships" xmlns:m="http://schemas.openxmlformats.org/officeDocument/2006/math" xmlns:v="urn:schemas-microsoft-com:vml" xmlns:wp14="http://schemas.microsoft.com/office/word/2010/wordprocessingDrawing" xmlns:wp="http://schemas.openxmlformats.org/drawingml/2006/wordprocessingDrawing" xmlns:w10="urn:schemas-microsoft-com:office:word" xmlns:w="http://schemas.openxmlformats.org/wordprocessingml/2006/main" xmlns:w14="http://schemas.microsoft.com/office/word/2010/wordml" xmlns:w15="http://schemas.microsoft.com/office/word/2012/wordml" xmlns:w16cex="http://schemas.microsoft.com/office/word/2018/wordml/cex" xmlns:w16cid="http://schemas.microsoft.com/office/word/2016/wordml/cid" xmlns:w16="http://schemas.microsoft.com/office/word/2018/wordml" xmlns:w16sdtdh="http://schemas.microsoft.com/office/word/2020/wordml/sdtdatahash" xmlns:w16se="http://schemas.microsoft.com/office/word/2015/wordml/symex" xmlns:wpg="http://schemas.microsoft.com/office/word/2010/wordprocessingGroup" xmlns:wpi="http://schemas.microsoft.com/office/word/2010/wordprocessingInk" xmlns:wne="http://schemas.microsoft.com/office/word/2006/wordml" xmlns:wps="http://schemas.microsoft.com/office/word/2010/wordprocessingShape" mc:Ignorable="w14 w15 w16se w16cid w16 w16cex w16sdtdh wp14">
   <w:endnote w:type="separator" w:id="-1">
     <w:p>
       <w:r>
@@ -2340,7 +1956,7 @@
 </file>
 
 <file path=word/footnotes.xml><?xml version="1.0" encoding="utf-8"?>
-<w:footnotes xmlns:wpc="http://schemas.microsoft.com/office/word/2010/wordprocessingCanvas" xmlns:cx="http://schemas.microsoft.com/office/drawing/2014/chartex" xmlns:cx1="http://schemas.microsoft.com/office/drawing/2015/9/8/chartex" xmlns:mc="http://schemas.openxmlformats.org/markup-compatibility/2006" xmlns:o="urn:schemas-microsoft-com:office:office" xmlns:r="http://schemas.openxmlformats.org/officeDocument/2006/relationships" xmlns:m="http://schemas.openxmlformats.org/officeDocument/2006/math" xmlns:v="urn:schemas-microsoft-com:vml" xmlns:wp14="http://schemas.microsoft.com/office/word/2010/wordprocessingDrawing" xmlns:wp="http://schemas.openxmlformats.org/drawingml/2006/wordprocessingDrawing" xmlns:w10="urn:schemas-microsoft-com:office:word" xmlns:w="http://schemas.openxmlformats.org/wordprocessingml/2006/main" xmlns:w14="http://schemas.microsoft.com/office/word/2010/wordml" xmlns:w15="http://schemas.microsoft.com/office/word/2012/wordml" xmlns:w16se="http://schemas.microsoft.com/office/word/2015/wordml/symex" xmlns:wpg="http://schemas.microsoft.com/office/word/2010/wordprocessingGroup" xmlns:wpi="http://schemas.microsoft.com/office/word/2010/wordprocessingInk" xmlns:wne="http://schemas.microsoft.com/office/word/2006/wordml" xmlns:wps="http://schemas.microsoft.com/office/word/2010/wordprocessingShape" mc:Ignorable="w14 w15 w16se wp14">
+<w:footnotes xmlns:wpc="http://schemas.microsoft.com/office/word/2010/wordprocessingCanvas" xmlns:cx="http://schemas.microsoft.com/office/drawing/2014/chartex" xmlns:cx1="http://schemas.microsoft.com/office/drawing/2015/9/8/chartex" xmlns:cx2="http://schemas.microsoft.com/office/drawing/2015/10/21/chartex" xmlns:cx3="http://schemas.microsoft.com/office/drawing/2016/5/9/chartex" xmlns:cx4="http://schemas.microsoft.com/office/drawing/2016/5/10/chartex" xmlns:cx5="http://schemas.microsoft.com/office/drawing/2016/5/11/chartex" xmlns:cx6="http://schemas.microsoft.com/office/drawing/2016/5/12/chartex" xmlns:cx7="http://schemas.microsoft.com/office/drawing/2016/5/13/chartex" xmlns:cx8="http://schemas.microsoft.com/office/drawing/2016/5/14/chartex" xmlns:mc="http://schemas.openxmlformats.org/markup-compatibility/2006" xmlns:aink="http://schemas.microsoft.com/office/drawing/2016/ink" xmlns:am3d="http://schemas.microsoft.com/office/drawing/2017/model3d" xmlns:o="urn:schemas-microsoft-com:office:office" xmlns:oel="http://schemas.microsoft.com/office/2019/extlst" xmlns:r="http://schemas.openxmlformats.org/officeDocument/2006/relationships" xmlns:m="http://schemas.openxmlformats.org/officeDocument/2006/math" xmlns:v="urn:schemas-microsoft-com:vml" xmlns:wp14="http://schemas.microsoft.com/office/word/2010/wordprocessingDrawing" xmlns:wp="http://schemas.openxmlformats.org/drawingml/2006/wordprocessingDrawing" xmlns:w10="urn:schemas-microsoft-com:office:word" xmlns:w="http://schemas.openxmlformats.org/wordprocessingml/2006/main" xmlns:w14="http://schemas.microsoft.com/office/word/2010/wordml" xmlns:w15="http://schemas.microsoft.com/office/word/2012/wordml" xmlns:w16cex="http://schemas.microsoft.com/office/word/2018/wordml/cex" xmlns:w16cid="http://schemas.microsoft.com/office/word/2016/wordml/cid" xmlns:w16="http://schemas.microsoft.com/office/word/2018/wordml" xmlns:w16sdtdh="http://schemas.microsoft.com/office/word/2020/wordml/sdtdatahash" xmlns:w16se="http://schemas.microsoft.com/office/word/2015/wordml/symex" xmlns:wpg="http://schemas.microsoft.com/office/word/2010/wordprocessingGroup" xmlns:wpi="http://schemas.microsoft.com/office/word/2010/wordprocessingInk" xmlns:wne="http://schemas.microsoft.com/office/word/2006/wordml" xmlns:wps="http://schemas.microsoft.com/office/word/2010/wordprocessingShape" mc:Ignorable="w14 w15 w16se w16cid w16 w16cex w16sdtdh wp14">
   <w:footnote w:type="separator" w:id="-1">
     <w:p>
       <w:r>
@@ -2359,21 +1975,27 @@
 </file>
 
 <file path=word/header1.xml><?xml version="1.0" encoding="utf-8"?>
-<w:hdr xmlns:wpc="http://schemas.microsoft.com/office/word/2010/wordprocessingCanvas" xmlns:cx="http://schemas.microsoft.com/office/drawing/2014/chartex" xmlns:cx1="http://schemas.microsoft.com/office/drawing/2015/9/8/chartex" xmlns:mc="http://schemas.openxmlformats.org/markup-compatibility/2006" xmlns:o="urn:schemas-microsoft-com:office:office" xmlns:r="http://schemas.openxmlformats.org/officeDocument/2006/relationships" xmlns:m="http://schemas.openxmlformats.org/officeDocument/2006/math" xmlns:v="urn:schemas-microsoft-com:vml" xmlns:wp14="http://schemas.microsoft.com/office/word/2010/wordprocessingDrawing" xmlns:wp="http://schemas.openxmlformats.org/drawingml/2006/wordprocessingDrawing" xmlns:w10="urn:schemas-microsoft-com:office:word" xmlns:w="http://schemas.openxmlformats.org/wordprocessingml/2006/main" xmlns:w14="http://schemas.microsoft.com/office/word/2010/wordml" xmlns:w15="http://schemas.microsoft.com/office/word/2012/wordml" xmlns:w16se="http://schemas.microsoft.com/office/word/2015/wordml/symex" xmlns:wpg="http://schemas.microsoft.com/office/word/2010/wordprocessingGroup" xmlns:wpi="http://schemas.microsoft.com/office/word/2010/wordprocessingInk" xmlns:wne="http://schemas.microsoft.com/office/word/2006/wordml" xmlns:wps="http://schemas.microsoft.com/office/word/2010/wordprocessingShape" mc:Ignorable="w14 w15 w16se wp14">
+<w:hdr xmlns:wpc="http://schemas.microsoft.com/office/word/2010/wordprocessingCanvas" xmlns:cx="http://schemas.microsoft.com/office/drawing/2014/chartex" xmlns:cx1="http://schemas.microsoft.com/office/drawing/2015/9/8/chartex" xmlns:cx2="http://schemas.microsoft.com/office/drawing/2015/10/21/chartex" xmlns:cx3="http://schemas.microsoft.com/office/drawing/2016/5/9/chartex" xmlns:cx4="http://schemas.microsoft.com/office/drawing/2016/5/10/chartex" xmlns:cx5="http://schemas.microsoft.com/office/drawing/2016/5/11/chartex" xmlns:cx6="http://schemas.microsoft.com/office/drawing/2016/5/12/chartex" xmlns:cx7="http://schemas.microsoft.com/office/drawing/2016/5/13/chartex" xmlns:cx8="http://schemas.microsoft.com/office/drawing/2016/5/14/chartex" xmlns:mc="http://schemas.openxmlformats.org/markup-compatibility/2006" xmlns:aink="http://schemas.microsoft.com/office/drawing/2016/ink" xmlns:am3d="http://schemas.microsoft.com/office/drawing/2017/model3d" xmlns:o="urn:schemas-microsoft-com:office:office" xmlns:oel="http://schemas.microsoft.com/office/2019/extlst" xmlns:r="http://schemas.openxmlformats.org/officeDocument/2006/relationships" xmlns:m="http://schemas.openxmlformats.org/officeDocument/2006/math" xmlns:v="urn:schemas-microsoft-com:vml" xmlns:wp14="http://schemas.microsoft.com/office/word/2010/wordprocessingDrawing" xmlns:wp="http://schemas.openxmlformats.org/drawingml/2006/wordprocessingDrawing" xmlns:w10="urn:schemas-microsoft-com:office:word" xmlns:w="http://schemas.openxmlformats.org/wordprocessingml/2006/main" xmlns:w14="http://schemas.microsoft.com/office/word/2010/wordml" xmlns:w15="http://schemas.microsoft.com/office/word/2012/wordml" xmlns:w16cex="http://schemas.microsoft.com/office/word/2018/wordml/cex" xmlns:w16cid="http://schemas.microsoft.com/office/word/2016/wordml/cid" xmlns:w16="http://schemas.microsoft.com/office/word/2018/wordml" xmlns:w16sdtdh="http://schemas.microsoft.com/office/word/2020/wordml/sdtdatahash" xmlns:w16se="http://schemas.microsoft.com/office/word/2015/wordml/symex" xmlns:wpg="http://schemas.microsoft.com/office/word/2010/wordprocessingGroup" xmlns:wpi="http://schemas.microsoft.com/office/word/2010/wordprocessingInk" xmlns:wne="http://schemas.microsoft.com/office/word/2006/wordml" xmlns:wps="http://schemas.microsoft.com/office/word/2010/wordprocessingShape" mc:Ignorable="w14 w15 w16se w16cid w16 w16cex w16sdtdh wp14">
   <w:p>
     <w:pPr>
       <w:pStyle w:val="Header"/>
       <w:jc w:val="center"/>
     </w:pPr>
     <w:r>
-      <w:t>ADDENDUM—AFFIDAVIT DISCLOSING CARE OR CUSTODY—{{ users}} v. {{ other_parties }}</w:t>
+      <w:t xml:space="preserve">ADDENDUM—AFFIDAVIT DISCLOSING CARE OR CUSTODY—{{ </w:t>
+    </w:r>
+    <w:r>
+      <w:t>case_name</w:t>
+    </w:r>
+    <w:r>
+      <w:t xml:space="preserve"> }}</w:t>
     </w:r>
   </w:p>
 </w:hdr>
 </file>
 
 <file path=word/numbering.xml><?xml version="1.0" encoding="utf-8"?>
-<w:numbering xmlns:wpc="http://schemas.microsoft.com/office/word/2010/wordprocessingCanvas" xmlns:cx="http://schemas.microsoft.com/office/drawing/2014/chartex" xmlns:cx1="http://schemas.microsoft.com/office/drawing/2015/9/8/chartex" xmlns:mc="http://schemas.openxmlformats.org/markup-compatibility/2006" xmlns:o="urn:schemas-microsoft-com:office:office" xmlns:r="http://schemas.openxmlformats.org/officeDocument/2006/relationships" xmlns:m="http://schemas.openxmlformats.org/officeDocument/2006/math" xmlns:v="urn:schemas-microsoft-com:vml" xmlns:wp14="http://schemas.microsoft.com/office/word/2010/wordprocessingDrawing" xmlns:wp="http://schemas.openxmlformats.org/drawingml/2006/wordprocessingDrawing" xmlns:w10="urn:schemas-microsoft-com:office:word" xmlns:w="http://schemas.openxmlformats.org/wordprocessingml/2006/main" xmlns:w14="http://schemas.microsoft.com/office/word/2010/wordml" xmlns:w15="http://schemas.microsoft.com/office/word/2012/wordml" xmlns:w16se="http://schemas.microsoft.com/office/word/2015/wordml/symex" xmlns:wpg="http://schemas.microsoft.com/office/word/2010/wordprocessingGroup" xmlns:wpi="http://schemas.microsoft.com/office/word/2010/wordprocessingInk" xmlns:wne="http://schemas.microsoft.com/office/word/2006/wordml" xmlns:wps="http://schemas.microsoft.com/office/word/2010/wordprocessingShape" mc:Ignorable="w14 w15 w16se wp14">
+<w:numbering xmlns:wpc="http://schemas.microsoft.com/office/word/2010/wordprocessingCanvas" xmlns:cx="http://schemas.microsoft.com/office/drawing/2014/chartex" xmlns:cx1="http://schemas.microsoft.com/office/drawing/2015/9/8/chartex" xmlns:cx2="http://schemas.microsoft.com/office/drawing/2015/10/21/chartex" xmlns:cx3="http://schemas.microsoft.com/office/drawing/2016/5/9/chartex" xmlns:cx4="http://schemas.microsoft.com/office/drawing/2016/5/10/chartex" xmlns:cx5="http://schemas.microsoft.com/office/drawing/2016/5/11/chartex" xmlns:cx6="http://schemas.microsoft.com/office/drawing/2016/5/12/chartex" xmlns:cx7="http://schemas.microsoft.com/office/drawing/2016/5/13/chartex" xmlns:cx8="http://schemas.microsoft.com/office/drawing/2016/5/14/chartex" xmlns:mc="http://schemas.openxmlformats.org/markup-compatibility/2006" xmlns:aink="http://schemas.microsoft.com/office/drawing/2016/ink" xmlns:am3d="http://schemas.microsoft.com/office/drawing/2017/model3d" xmlns:o="urn:schemas-microsoft-com:office:office" xmlns:oel="http://schemas.microsoft.com/office/2019/extlst" xmlns:r="http://schemas.openxmlformats.org/officeDocument/2006/relationships" xmlns:m="http://schemas.openxmlformats.org/officeDocument/2006/math" xmlns:v="urn:schemas-microsoft-com:vml" xmlns:wp14="http://schemas.microsoft.com/office/word/2010/wordprocessingDrawing" xmlns:wp="http://schemas.openxmlformats.org/drawingml/2006/wordprocessingDrawing" xmlns:w10="urn:schemas-microsoft-com:office:word" xmlns:w="http://schemas.openxmlformats.org/wordprocessingml/2006/main" xmlns:w14="http://schemas.microsoft.com/office/word/2010/wordml" xmlns:w15="http://schemas.microsoft.com/office/word/2012/wordml" xmlns:w16cex="http://schemas.microsoft.com/office/word/2018/wordml/cex" xmlns:w16cid="http://schemas.microsoft.com/office/word/2016/wordml/cid" xmlns:w16="http://schemas.microsoft.com/office/word/2018/wordml" xmlns:w16sdtdh="http://schemas.microsoft.com/office/word/2020/wordml/sdtdatahash" xmlns:w16se="http://schemas.microsoft.com/office/word/2015/wordml/symex" xmlns:wpg="http://schemas.microsoft.com/office/word/2010/wordprocessingGroup" xmlns:wpi="http://schemas.microsoft.com/office/word/2010/wordprocessingInk" xmlns:wne="http://schemas.microsoft.com/office/word/2006/wordml" xmlns:wps="http://schemas.microsoft.com/office/word/2010/wordprocessingShape" mc:Ignorable="w14 w15 w16se w16cid w16 w16cex w16sdtdh wp14">
   <w:abstractNum w:abstractNumId="0" w15:restartNumberingAfterBreak="0">
     <w:nsid w:val="0F8A4A4F"/>
     <w:multiLevelType w:val="hybridMultilevel"/>
@@ -3004,29 +2626,29 @@
       </w:pPr>
     </w:lvl>
   </w:abstractNum>
-  <w:num w:numId="1">
+  <w:num w:numId="1" w16cid:durableId="1292632114">
     <w:abstractNumId w:val="0"/>
   </w:num>
-  <w:num w:numId="2">
+  <w:num w:numId="2" w16cid:durableId="473105717">
     <w:abstractNumId w:val="4"/>
   </w:num>
-  <w:num w:numId="3">
+  <w:num w:numId="3" w16cid:durableId="1431200614">
     <w:abstractNumId w:val="3"/>
   </w:num>
-  <w:num w:numId="4">
+  <w:num w:numId="4" w16cid:durableId="929774480">
     <w:abstractNumId w:val="1"/>
   </w:num>
-  <w:num w:numId="5">
+  <w:num w:numId="5" w16cid:durableId="1482621167">
     <w:abstractNumId w:val="2"/>
   </w:num>
-  <w:num w:numId="6">
+  <w:num w:numId="6" w16cid:durableId="167215056">
     <w:abstractNumId w:val="5"/>
   </w:num>
 </w:numbering>
 </file>
 
 <file path=word/styles.xml><?xml version="1.0" encoding="utf-8"?>
-<w:styles xmlns:mc="http://schemas.openxmlformats.org/markup-compatibility/2006" xmlns:r="http://schemas.openxmlformats.org/officeDocument/2006/relationships" xmlns:w="http://schemas.openxmlformats.org/wordprocessingml/2006/main" xmlns:w14="http://schemas.microsoft.com/office/word/2010/wordml" xmlns:w15="http://schemas.microsoft.com/office/word/2012/wordml" xmlns:w16se="http://schemas.microsoft.com/office/word/2015/wordml/symex" mc:Ignorable="w14 w15 w16se">
+<w:styles xmlns:mc="http://schemas.openxmlformats.org/markup-compatibility/2006" xmlns:r="http://schemas.openxmlformats.org/officeDocument/2006/relationships" xmlns:w="http://schemas.openxmlformats.org/wordprocessingml/2006/main" xmlns:w14="http://schemas.microsoft.com/office/word/2010/wordml" xmlns:w15="http://schemas.microsoft.com/office/word/2012/wordml" xmlns:w16cex="http://schemas.microsoft.com/office/word/2018/wordml/cex" xmlns:w16cid="http://schemas.microsoft.com/office/word/2016/wordml/cid" xmlns:w16="http://schemas.microsoft.com/office/word/2018/wordml" xmlns:w16sdtdh="http://schemas.microsoft.com/office/word/2020/wordml/sdtdatahash" xmlns:w16se="http://schemas.microsoft.com/office/word/2015/wordml/symex" mc:Ignorable="w14 w15 w16se w16cid w16 w16cex w16sdtdh">
   <w:docDefaults>
     <w:rPrDefault>
       <w:rPr>
@@ -3039,7 +2661,7 @@
     </w:rPrDefault>
     <w:pPrDefault/>
   </w:docDefaults>
-  <w:latentStyles w:defLockedState="0" w:defUIPriority="99" w:defSemiHidden="0" w:defUnhideWhenUsed="0" w:defQFormat="0" w:count="371">
+  <w:latentStyles w:defLockedState="0" w:defUIPriority="99" w:defSemiHidden="0" w:defUnhideWhenUsed="0" w:defQFormat="0" w:count="376">
     <w:lsdException w:name="Normal" w:uiPriority="0" w:qFormat="1"/>
     <w:lsdException w:name="heading 1" w:uiPriority="9" w:qFormat="1"/>
     <w:lsdException w:name="heading 2" w:semiHidden="1" w:uiPriority="9" w:unhideWhenUsed="1" w:qFormat="1"/>
@@ -3411,6 +3033,11 @@
     <w:lsdException w:name="List Table 5 Dark Accent 6" w:uiPriority="50"/>
     <w:lsdException w:name="List Table 6 Colorful Accent 6" w:uiPriority="51"/>
     <w:lsdException w:name="List Table 7 Colorful Accent 6" w:uiPriority="52"/>
+    <w:lsdException w:name="Mention" w:semiHidden="1" w:unhideWhenUsed="1"/>
+    <w:lsdException w:name="Smart Hyperlink" w:semiHidden="1" w:unhideWhenUsed="1"/>
+    <w:lsdException w:name="Hashtag" w:semiHidden="1" w:unhideWhenUsed="1"/>
+    <w:lsdException w:name="Unresolved Mention" w:semiHidden="1" w:unhideWhenUsed="1"/>
+    <w:lsdException w:name="Smart Link" w:semiHidden="1" w:unhideWhenUsed="1"/>
   </w:latentStyles>
   <w:style w:type="paragraph" w:default="1" w:styleId="Normal">
     <w:name w:val="Normal"/>
@@ -3420,7 +3047,6 @@
   <w:style w:type="character" w:default="1" w:styleId="DefaultParagraphFont">
     <w:name w:val="Default Paragraph Font"/>
     <w:uiPriority w:val="1"/>
-    <w:semiHidden/>
     <w:unhideWhenUsed/>
   </w:style>
   <w:style w:type="table" w:default="1" w:styleId="TableNormal">

</xml_diff>